<commit_message>
docs: fix diagram label spacing and add answer-to-user step in runtime flows
</commit_message>
<xml_diff>
--- a/docs/Growthpoint-Knowledge-Assistant-Solution-Overview.docx
+++ b/docs/Growthpoint-Knowledge-Assistant-Solution-Overview.docx
@@ -1279,7 +1279,7 @@
       <w:r>
         <w:drawing>
           <wp:inline>
-            <wp:extent cx="6263640" cy="1079390"/>
+            <wp:extent cx="6263640" cy="1074711"/>
             <wp:effectExtent b="0" l="0" r="0" t="0"/>
             <wp:docPr descr="AWS ingestion pipeline for the Growthpoint Knowledge Assistant" title="" id="33" name="Picture"/>
             <a:graphic>
@@ -1300,7 +1300,7 @@
                   <pic:spPr bwMode="auto">
                     <a:xfrm>
                       <a:off x="0" y="0"/>
-                      <a:ext cx="6263640" cy="1079390"/>
+                      <a:ext cx="6263640" cy="1074711"/>
                     </a:xfrm>
                     <a:prstGeom prst="rect">
                       <a:avLst/>
@@ -1472,7 +1472,7 @@
       <w:r>
         <w:drawing>
           <wp:inline>
-            <wp:extent cx="6263640" cy="885945"/>
+            <wp:extent cx="6263640" cy="771518"/>
             <wp:effectExtent b="0" l="0" r="0" t="0"/>
             <wp:docPr descr="AWS question-and-answer flow for the Growthpoint Knowledge Assistant" title="" id="36" name="Picture"/>
             <a:graphic>
@@ -1493,7 +1493,7 @@
                   <pic:spPr bwMode="auto">
                     <a:xfrm>
                       <a:off x="0" y="0"/>
-                      <a:ext cx="6263640" cy="885945"/>
+                      <a:ext cx="6263640" cy="771518"/>
                     </a:xfrm>
                     <a:prstGeom prst="rect">
                       <a:avLst/>
@@ -1698,7 +1698,29 @@
         <w:t xml:space="preserve"> </w:t>
       </w:r>
       <w:r>
-        <w:t xml:space="preserve">and streams the grounded answer, with compact numbered sources, back through the app.</w:t>
+        <w:t xml:space="preserve">and generates the grounded answer.</w:t>
+      </w:r>
+    </w:p>
+    <w:p>
+      <w:pPr>
+        <w:pStyle w:val="Compact"/>
+        <w:numPr>
+          <w:ilvl w:val="0"/>
+          <w:numId w:val="1004"/>
+        </w:numPr>
+      </w:pPr>
+      <w:r>
+        <w:rPr>
+          <w:b/>
+          <w:bCs/>
+        </w:rPr>
+        <w:t xml:space="preserve">The answer streams back to the user</w:t>
+      </w:r>
+      <w:r>
+        <w:t xml:space="preserve"> </w:t>
+      </w:r>
+      <w:r>
+        <w:t xml:space="preserve">through the app, with compact numbered sources, appearing word by word as it is generated.</w:t>
       </w:r>
     </w:p>
     <w:p>
@@ -2486,7 +2508,7 @@
       <w:r>
         <w:drawing>
           <wp:inline>
-            <wp:extent cx="6263640" cy="896941"/>
+            <wp:extent cx="6263640" cy="915353"/>
             <wp:effectExtent b="0" l="0" r="0" t="0"/>
             <wp:docPr descr="Azure ingestion pipeline for the Growthpoint Knowledge Assistant" title="" id="47" name="Picture"/>
             <a:graphic>
@@ -2507,7 +2529,7 @@
                   <pic:spPr bwMode="auto">
                     <a:xfrm>
                       <a:off x="0" y="0"/>
-                      <a:ext cx="6263640" cy="896941"/>
+                      <a:ext cx="6263640" cy="915353"/>
                     </a:xfrm>
                     <a:prstGeom prst="rect">
                       <a:avLst/>
@@ -2755,7 +2777,7 @@
       <w:r>
         <w:drawing>
           <wp:inline>
-            <wp:extent cx="6263640" cy="888038"/>
+            <wp:extent cx="6263640" cy="772198"/>
             <wp:effectExtent b="0" l="0" r="0" t="0"/>
             <wp:docPr descr="Azure question-and-answer flow for the Growthpoint Knowledge Assistant" title="" id="53" name="Picture"/>
             <a:graphic>
@@ -2776,7 +2798,7 @@
                   <pic:spPr bwMode="auto">
                     <a:xfrm>
                       <a:off x="0" y="0"/>
-                      <a:ext cx="6263640" cy="888038"/>
+                      <a:ext cx="6263640" cy="772198"/>
                     </a:xfrm>
                     <a:prstGeom prst="rect">
                       <a:avLst/>
@@ -2990,7 +3012,29 @@
         <w:t xml:space="preserve"> </w:t>
       </w:r>
       <w:r>
-        <w:t xml:space="preserve">(for example GPT-4o mini) streams the grounded answer with citations from the permitted results only.</w:t>
+        <w:t xml:space="preserve">(for example GPT-4o mini) generates the grounded answer from the permitted results only.</w:t>
+      </w:r>
+    </w:p>
+    <w:p>
+      <w:pPr>
+        <w:pStyle w:val="Compact"/>
+        <w:numPr>
+          <w:ilvl w:val="0"/>
+          <w:numId w:val="1006"/>
+        </w:numPr>
+      </w:pPr>
+      <w:r>
+        <w:rPr>
+          <w:b/>
+          <w:bCs/>
+        </w:rPr>
+        <w:t xml:space="preserve">The answer streams back to the user</w:t>
+      </w:r>
+      <w:r>
+        <w:t xml:space="preserve"> </w:t>
+      </w:r>
+      <w:r>
+        <w:t xml:space="preserve">with citations, appearing as it is generated.</w:t>
       </w:r>
     </w:p>
     <w:p>

</xml_diff>